<commit_message>
TurboSign for Salesforce 1.1.0: preview, write-back org id, connection and panel fixes; README ecosystem and footer
</commit_message>
<xml_diff>
--- a/unpackaged/sample/Service Agreement.docx
+++ b/unpackaged/sample/Service Agreement.docx
@@ -106,10 +106,16 @@
     </w:p>
     <w:p>
       <w:pPr>
-        <w:spacing w:after="240"/>
+        <w:spacing w:before="480" w:after="1440"/>
       </w:pPr>
       <w:r>
-        <w:t>Signature: {sig}</w:t>
+        <w:t xml:space="preserve">Signature: </w:t>
+      </w:r>
+      <w:r>
+        <w:rPr>
+          <w:color w:val="FFFFFF"/>
+        </w:rPr>
+        <w:t>{sig}</w:t>
       </w:r>
     </w:p>
     <w:p>
@@ -117,7 +123,13 @@
         <w:spacing w:after="160"/>
       </w:pPr>
       <w:r>
-        <w:t>Date: {date}</w:t>
+        <w:t xml:space="preserve">Date: </w:t>
+      </w:r>
+      <w:r>
+        <w:rPr>
+          <w:color w:val="FFFFFF"/>
+        </w:rPr>
+        <w:t>{date}</w:t>
       </w:r>
     </w:p>
     <w:sectPr>

</xml_diff>